<commit_message>
Reframe project around the UCI leakage ablation and rename paper
</commit_message>
<xml_diff>
--- a/documentation/ownership_declaration.docx
+++ b/documentation/ownership_declaration.docx
@@ -81,12 +81,8 @@
             <w:tcW w:type="dxa" w:w="4320"/>
           </w:tcPr>
           <w:p>
-            <w:r/>
             <w:r>
-              <w:rPr>
-                <w:sz w:val="20"/>
-              </w:rPr>
-              <w:t>Pre-lab CKD Early Detection using Random Forest</w:t>
+              <w:t>Beyond 99%: Diagnostic Leakage in CKD Prediction and a Pre-lab Screening Check</w:t>
             </w:r>
           </w:p>
         </w:tc>

</xml_diff>

<commit_message>
Add full author name, section and submission date
</commit_message>
<xml_diff>
--- a/documentation/ownership_declaration.docx
+++ b/documentation/ownership_declaration.docx
@@ -107,12 +107,8 @@
             <w:tcW w:type="dxa" w:w="4320"/>
           </w:tcPr>
           <w:p>
-            <w:r/>
             <w:r>
-              <w:rPr>
-                <w:sz w:val="20"/>
-              </w:rPr>
-              <w:t>____________________________________________</w:t>
+              <w:t>COM241</w:t>
             </w:r>
           </w:p>
         </w:tc>
@@ -167,12 +163,8 @@
             <w:tcW w:type="dxa" w:w="4320"/>
           </w:tcPr>
           <w:p>
-            <w:r/>
             <w:r>
-              <w:rPr>
-                <w:sz w:val="20"/>
-              </w:rPr>
-              <w:t>____________________________________________</w:t>
+              <w:t>10/15/2026</w:t>
             </w:r>
           </w:p>
         </w:tc>
@@ -320,7 +312,7 @@
               <w:rPr>
                 <w:sz w:val="20"/>
               </w:rPr>
-              <w:t>Antonio Garcia</w:t>
+              <w:t>Antonio B. Garcia Jr.</w:t>
               <w:br/>
               <w:t>Student Group Member</w:t>
             </w:r>

</xml_diff>